<commit_message>
Atualizando cidade Cabreuva - SP e ano 2026 na capa
</commit_message>
<xml_diff>
--- a/Atividade_Pratica_BaoziStore_Murilo_4425054.docx
+++ b/Atividade_Pratica_BaoziStore_Murilo_4425054.docx
@@ -101,9 +101,9 @@
         <w:rPr>
           <w:sz w:val="24"/>
         </w:rPr>
-        <w:t>Curitiba – PR</w:t>
+        <w:t>Cabreúva – SP</w:t>
         <w:br/>
-        <w:t>2025</w:t>
+        <w:t>2026</w:t>
       </w:r>
     </w:p>
     <w:p>

</xml_diff>

<commit_message>
Removendo nota instrucional da secao do GitHub
</commit_message>
<xml_diff>
--- a/Atividade_Pratica_BaoziStore_Murilo_4425054.docx
+++ b/Atividade_Pratica_BaoziStore_Murilo_4425054.docx
@@ -2001,18 +2001,6 @@
         <w:t>https://github.com/MuriloBauermann/baozi-store</w:t>
       </w:r>
     </w:p>
-    <w:p>
-      <w:pPr>
-        <w:spacing w:before="300"/>
-      </w:pPr>
-      <w:r>
-        <w:rPr>
-          <w:i/>
-          <w:sz w:val="20"/>
-        </w:rPr>
-        <w:t>*(Nota: Caso utilize outro usuário ou nome no GitHub, basta atualizar a URL acima antes da conversão final para PDF.)*</w:t>
-      </w:r>
-    </w:p>
     <w:sectPr>
       <w:pgSz w:w="12240" w:h="15840"/>
       <w:pgMar w:top="1440" w:right="1440" w:bottom="1440" w:left="1440" w:header="720" w:footer="720" w:gutter="0"/>

</xml_diff>